<commit_message>
Audit against the brief: honest status, stable IDs, recovered assay methods
Checking the shipped data against each clause of the task rather than
against the headline count surfaced three problems:

- measurement_id was positional, so any rebuild reshuffled ids and
  silently invalidated the manual-review exclusion list (22 exclusions
  stopped applying). IDs are now content-addressed and verified stable
  across rebuilds.
- assay method, an explicitly required field, sat at 2.3% because it is
  stated once in Methods, not beside each value. Recovered at article
  level from cached XML and labelled assay_method_scope; now 32%.
  Substrate likewise 22% -> 38%.
- the brief's field list is satisfied in full by 89 rows, not 528. The
  docx now COMPUTES its status column from the data instead of
  asserting "Met", and reports the salinity / mixed-electrolyte gaps
  and the uncoordinated split with Luke as not met.

Co-Authored-By: Claude Opus 5 <noreply@anthropic.com>
</commit_message>
<xml_diff>
--- a/PET_Benchmark_Week2_Final_Brief.docx
+++ b/PET_Benchmark_Week2_Final_Brief.docx
@@ -114,7 +114,7 @@
       <w:tr>
         <w:tc>
           <w:tcPr>
-            <w:tcW w:type="dxa" w:w="5040"/>
+            <w:tcW w:type="dxa" w:w="4320"/>
             <w:shd w:val="clear" w:fill="1F3B57"/>
           </w:tcPr>
           <w:p>
@@ -131,7 +131,7 @@
         </w:tc>
         <w:tc>
           <w:tcPr>
-            <w:tcW w:type="dxa" w:w="3600"/>
+            <w:tcW w:type="dxa" w:w="3888"/>
             <w:shd w:val="clear" w:fill="1F3B57"/>
           </w:tcPr>
           <w:p>
@@ -148,7 +148,7 @@
         </w:tc>
         <w:tc>
           <w:tcPr>
-            <w:tcW w:type="dxa" w:w="1368"/>
+            <w:tcW w:type="dxa" w:w="1224"/>
             <w:shd w:val="clear" w:fill="1F3B57"/>
           </w:tcPr>
           <w:p>
@@ -167,7 +167,7 @@
       <w:tr>
         <w:tc>
           <w:tcPr>
-            <w:tcW w:type="dxa" w:w="5040"/>
+            <w:tcW w:type="dxa" w:w="4320"/>
           </w:tcPr>
           <w:p>
             <w:r/>
@@ -175,13 +175,13 @@
               <w:rPr>
                 <w:sz w:val="19"/>
               </w:rPr>
-              <w:t>≥ 300 new experimental measurements</w:t>
+              <w:t>≥ 300 measurements recording the full field set (identifier, conditions, value, units, source)</w:t>
             </w:r>
           </w:p>
         </w:tc>
         <w:tc>
           <w:tcPr>
-            <w:tcW w:type="dxa" w:w="3600"/>
+            <w:tcW w:type="dxa" w:w="3888"/>
           </w:tcPr>
           <w:p>
             <w:r/>
@@ -189,13 +189,13 @@
               <w:rPr>
                 <w:sz w:val="19"/>
               </w:rPr>
-              <w:t>528</w:t>
+              <w:t>89 fully specified; 528 measurements in total</w:t>
             </w:r>
           </w:p>
         </w:tc>
         <w:tc>
           <w:tcPr>
-            <w:tcW w:type="dxa" w:w="1368"/>
+            <w:tcW w:type="dxa" w:w="1224"/>
           </w:tcPr>
           <w:p>
             <w:r/>
@@ -203,7 +203,7 @@
               <w:rPr>
                 <w:sz w:val="19"/>
               </w:rPr>
-              <w:t>Met</w:t>
+              <w:t>Partial</w:t>
             </w:r>
           </w:p>
         </w:tc>
@@ -211,7 +211,7 @@
       <w:tr>
         <w:tc>
           <w:tcPr>
-            <w:tcW w:type="dxa" w:w="5040"/>
+            <w:tcW w:type="dxa" w:w="4320"/>
             <w:shd w:val="clear" w:fill="F4F6F8"/>
           </w:tcPr>
           <w:p>
@@ -226,7 +226,7 @@
         </w:tc>
         <w:tc>
           <w:tcPr>
-            <w:tcW w:type="dxa" w:w="3600"/>
+            <w:tcW w:type="dxa" w:w="3888"/>
             <w:shd w:val="clear" w:fill="F4F6F8"/>
           </w:tcPr>
           <w:p>
@@ -235,13 +235,13 @@
               <w:rPr>
                 <w:sz w:val="19"/>
               </w:rPr>
-              <w:t>79 distinct articles</w:t>
+              <w:t>79 articles overall; 20 contribute a fully specified row</w:t>
             </w:r>
           </w:p>
         </w:tc>
         <w:tc>
           <w:tcPr>
-            <w:tcW w:type="dxa" w:w="1368"/>
+            <w:tcW w:type="dxa" w:w="1224"/>
             <w:shd w:val="clear" w:fill="F4F6F8"/>
           </w:tcPr>
           <w:p>
@@ -258,7 +258,7 @@
       <w:tr>
         <w:tc>
           <w:tcPr>
-            <w:tcW w:type="dxa" w:w="5040"/>
+            <w:tcW w:type="dxa" w:w="4320"/>
           </w:tcPr>
           <w:p>
             <w:r/>
@@ -272,7 +272,7 @@
         </w:tc>
         <w:tc>
           <w:tcPr>
-            <w:tcW w:type="dxa" w:w="3600"/>
+            <w:tcW w:type="dxa" w:w="3888"/>
           </w:tcPr>
           <w:p>
             <w:r/>
@@ -280,13 +280,13 @@
               <w:rPr>
                 <w:sz w:val="19"/>
               </w:rPr>
-              <w:t>110 read against source; all 528 also machine-verified</w:t>
+              <w:t>110 read against source; all 528 machine-verified</w:t>
             </w:r>
           </w:p>
         </w:tc>
         <w:tc>
           <w:tcPr>
-            <w:tcW w:type="dxa" w:w="1368"/>
+            <w:tcW w:type="dxa" w:w="1224"/>
           </w:tcPr>
           <w:p>
             <w:r/>
@@ -302,7 +302,7 @@
       <w:tr>
         <w:tc>
           <w:tcPr>
-            <w:tcW w:type="dxa" w:w="5040"/>
+            <w:tcW w:type="dxa" w:w="4320"/>
             <w:shd w:val="clear" w:fill="F4F6F8"/>
           </w:tcPr>
           <w:p>
@@ -317,7 +317,7 @@
         </w:tc>
         <w:tc>
           <w:tcPr>
-            <w:tcW w:type="dxa" w:w="3600"/>
+            <w:tcW w:type="dxa" w:w="3888"/>
             <w:shd w:val="clear" w:fill="F4F6F8"/>
           </w:tcPr>
           <w:p>
@@ -332,7 +332,7 @@
         </w:tc>
         <w:tc>
           <w:tcPr>
-            <w:tcW w:type="dxa" w:w="1368"/>
+            <w:tcW w:type="dxa" w:w="1224"/>
             <w:shd w:val="clear" w:fill="F4F6F8"/>
           </w:tcPr>
           <w:p>
@@ -349,7 +349,7 @@
       <w:tr>
         <w:tc>
           <w:tcPr>
-            <w:tcW w:type="dxa" w:w="5040"/>
+            <w:tcW w:type="dxa" w:w="4320"/>
           </w:tcPr>
           <w:p>
             <w:r/>
@@ -363,7 +363,7 @@
         </w:tc>
         <w:tc>
           <w:tcPr>
-            <w:tcW w:type="dxa" w:w="3600"/>
+            <w:tcW w:type="dxa" w:w="3888"/>
           </w:tcPr>
           <w:p>
             <w:r/>
@@ -377,7 +377,7 @@
         </w:tc>
         <w:tc>
           <w:tcPr>
-            <w:tcW w:type="dxa" w:w="1368"/>
+            <w:tcW w:type="dxa" w:w="1224"/>
           </w:tcPr>
           <w:p>
             <w:r/>
@@ -393,7 +393,7 @@
       <w:tr>
         <w:tc>
           <w:tcPr>
-            <w:tcW w:type="dxa" w:w="5040"/>
+            <w:tcW w:type="dxa" w:w="4320"/>
             <w:shd w:val="clear" w:fill="F4F6F8"/>
           </w:tcPr>
           <w:p>
@@ -408,7 +408,7 @@
         </w:tc>
         <w:tc>
           <w:tcPr>
-            <w:tcW w:type="dxa" w:w="3600"/>
+            <w:tcW w:type="dxa" w:w="3888"/>
             <w:shd w:val="clear" w:fill="F4F6F8"/>
           </w:tcPr>
           <w:p>
@@ -423,7 +423,7 @@
         </w:tc>
         <w:tc>
           <w:tcPr>
-            <w:tcW w:type="dxa" w:w="1368"/>
+            <w:tcW w:type="dxa" w:w="1224"/>
             <w:shd w:val="clear" w:fill="F4F6F8"/>
           </w:tcPr>
           <w:p>
@@ -440,7 +440,98 @@
       <w:tr>
         <w:tc>
           <w:tcPr>
-            <w:tcW w:type="dxa" w:w="5040"/>
+            <w:tcW w:type="dxa" w:w="4320"/>
+          </w:tcPr>
+          <w:p>
+            <w:r/>
+            <w:r>
+              <w:rPr>
+                <w:sz w:val="19"/>
+              </w:rPr>
+              <w:t>Temperature, pH, salts and ions covered</w:t>
+            </w:r>
+          </w:p>
+        </w:tc>
+        <w:tc>
+          <w:tcPr>
+            <w:tcW w:type="dxa" w:w="3888"/>
+          </w:tcPr>
+          <w:p>
+            <w:r/>
+            <w:r>
+              <w:rPr>
+                <w:sz w:val="19"/>
+              </w:rPr>
+              <w:t>T 199 · pH 88 · electrolyte 115</w:t>
+            </w:r>
+          </w:p>
+        </w:tc>
+        <w:tc>
+          <w:tcPr>
+            <w:tcW w:type="dxa" w:w="1224"/>
+          </w:tcPr>
+          <w:p>
+            <w:r/>
+            <w:r>
+              <w:rPr>
+                <w:sz w:val="19"/>
+              </w:rPr>
+              <w:t>Met</w:t>
+            </w:r>
+          </w:p>
+        </w:tc>
+      </w:tr>
+      <w:tr>
+        <w:tc>
+          <w:tcPr>
+            <w:tcW w:type="dxa" w:w="4320"/>
+            <w:shd w:val="clear" w:fill="F4F6F8"/>
+          </w:tcPr>
+          <w:p>
+            <w:r/>
+            <w:r>
+              <w:rPr>
+                <w:sz w:val="19"/>
+              </w:rPr>
+              <w:t>Salinity and mixed-electrolyte conditions covered</w:t>
+            </w:r>
+          </w:p>
+        </w:tc>
+        <w:tc>
+          <w:tcPr>
+            <w:tcW w:type="dxa" w:w="3888"/>
+            <w:shd w:val="clear" w:fill="F4F6F8"/>
+          </w:tcPr>
+          <w:p>
+            <w:r/>
+            <w:r>
+              <w:rPr>
+                <w:sz w:val="19"/>
+              </w:rPr>
+              <w:t>salinity 0 · mixed electrolyte 2</w:t>
+            </w:r>
+          </w:p>
+        </w:tc>
+        <w:tc>
+          <w:tcPr>
+            <w:tcW w:type="dxa" w:w="1224"/>
+            <w:shd w:val="clear" w:fill="F4F6F8"/>
+          </w:tcPr>
+          <w:p>
+            <w:r/>
+            <w:r>
+              <w:rPr>
+                <w:sz w:val="19"/>
+              </w:rPr>
+              <w:t>Not met</w:t>
+            </w:r>
+          </w:p>
+        </w:tc>
+      </w:tr>
+      <w:tr>
+        <w:tc>
+          <w:tcPr>
+            <w:tcW w:type="dxa" w:w="4320"/>
           </w:tcPr>
           <w:p>
             <w:r/>
@@ -454,7 +545,7 @@
         </w:tc>
         <w:tc>
           <w:tcPr>
-            <w:tcW w:type="dxa" w:w="3600"/>
+            <w:tcW w:type="dxa" w:w="3888"/>
           </w:tcPr>
           <w:p>
             <w:r/>
@@ -468,7 +559,7 @@
         </w:tc>
         <w:tc>
           <w:tcPr>
-            <w:tcW w:type="dxa" w:w="1368"/>
+            <w:tcW w:type="dxa" w:w="1224"/>
           </w:tcPr>
           <w:p>
             <w:r/>
@@ -477,6 +568,93 @@
                 <w:sz w:val="19"/>
               </w:rPr>
               <w:t>Pending her sign-off</w:t>
+            </w:r>
+          </w:p>
+        </w:tc>
+      </w:tr>
+      <w:tr>
+        <w:tc>
+          <w:tcPr>
+            <w:tcW w:type="dxa" w:w="4320"/>
+            <w:shd w:val="clear" w:fill="F4F6F8"/>
+          </w:tcPr>
+          <w:p>
+            <w:r/>
+            <w:r>
+              <w:rPr>
+                <w:sz w:val="19"/>
+              </w:rPr>
+              <w:t>Split the workload evenly with Luke</w:t>
+            </w:r>
+          </w:p>
+        </w:tc>
+        <w:tc>
+          <w:tcPr>
+            <w:tcW w:type="dxa" w:w="3888"/>
+            <w:shd w:val="clear" w:fill="F4F6F8"/>
+          </w:tcPr>
+          <w:p>
+            <w:r/>
+            <w:r>
+              <w:rPr>
+                <w:sz w:val="19"/>
+              </w:rPr>
+              <w:t>Not coordinated — built independently against his published outputs</w:t>
+            </w:r>
+          </w:p>
+        </w:tc>
+        <w:tc>
+          <w:tcPr>
+            <w:tcW w:type="dxa" w:w="1224"/>
+            <w:shd w:val="clear" w:fill="F4F6F8"/>
+          </w:tcPr>
+          <w:p>
+            <w:r/>
+            <w:r>
+              <w:rPr>
+                <w:sz w:val="19"/>
+              </w:rPr>
+              <w:t>Not met</w:t>
+            </w:r>
+          </w:p>
+        </w:tc>
+      </w:tr>
+    </w:tbl>
+    <w:p>
+      <w:pPr>
+        <w:spacing w:after="40"/>
+      </w:pPr>
+    </w:p>
+    <w:tbl>
+      <w:tblPr>
+        <w:tblStyle w:val="TableGrid"/>
+        <w:tblW w:type="auto" w:w="0"/>
+        <w:tblLook w:firstColumn="1" w:firstRow="1" w:lastColumn="0" w:lastRow="0" w:noHBand="0" w:noVBand="1" w:val="04A0"/>
+      </w:tblPr>
+      <w:tblGrid>
+        <w:gridCol w:w="9792"/>
+      </w:tblGrid>
+      <w:tr>
+        <w:tc>
+          <w:tcPr>
+            <w:tcW w:type="dxa" w:w="9792"/>
+            <w:shd w:val="clear" w:fill="F8F4E8"/>
+          </w:tcPr>
+          <w:p>
+            <w:r/>
+            <w:r>
+              <w:rPr>
+                <w:b/>
+                <w:color w:val="1F3B57"/>
+                <w:sz w:val="20"/>
+              </w:rPr>
+              <w:t xml:space="preserve">Read the status column honestly.  </w:t>
+            </w:r>
+            <w:r>
+              <w:rPr>
+                <w:sz w:val="20"/>
+              </w:rPr>
+              <w:t>This benchmark contains 528 verified measurements, but only 89 of them carry a resolved protein identifier alongside a condition and a value — the combination the brief asks for. The shortfall is a sequence-resolution limit, not a data-quality one, and is explained in section 6. The remaining rows are real, verified measurements that a sequence model cannot consume.</w:t>
             </w:r>
           </w:p>
         </w:tc>
@@ -935,7 +1113,7 @@
           <w:color w:val="5A5A5A"/>
           <w:sz w:val="19"/>
         </w:rPr>
-        <w:t>Ions covered: Na(+) (27), Ca(2+) (21), Mg(2+) (14), Zn(2+) (10), Cu(2+) (10), K(+) (7), Co(2+) (6), Mn(2+) (6), Fe(3+) (5), Fe(2+) (2), Ba(2+) (2), NH4(+) (2), Li(+) (1), Hg(2+) (1), Ni(2+) (1)</w:t>
+        <w:t>Ions covered: Na(+) (27), Ca(2+) (21), Mg(2+) (14), Cu(2+) (10), Zn(2+) (10), K(+) (7), Mn(2+) (6), Co(2+) (6), Fe(3+) (5), Fe(2+) (2), NH4(+) (2), Ba(2+) (2), Ni(2+) (1), Hg(2+) (1), Li(+) (1)</w:t>
       </w:r>
     </w:p>
     <w:p>
@@ -949,7 +1127,7 @@
           <w:color w:val="5A5A5A"/>
           <w:sz w:val="19"/>
         </w:rPr>
-        <w:t>Salts covered: NaCl (22), CaCl2 (9), MgCl2 (5), KCl (3), ZnCl2 (2), CoCl2 (2), FeCl3 (2), CuSO4 (2), ZnSO4 (2), CuCl2 (2), MnSO4 (1), MgSO4 (1), BaCl2 (1), HgCl2 (1), MnCl2 (1), NiCl2 (1)</w:t>
+        <w:t>Salts covered: NaCl (22), CaCl2 (9), MgCl2 (5), KCl (3), CuSO4 (2), CuCl2 (2), FeCl3 (2), CoCl2 (2), ZnSO4 (2), ZnCl2 (2), MnCl2 (1), NiCl2 (1), HgCl2 (1), MgSO4 (1), MnSO4 (1), BaCl2 (1)</w:t>
       </w:r>
     </w:p>
     <w:p>
@@ -4806,7 +4984,7 @@
               <w:rPr>
                 <w:sz w:val="19"/>
               </w:rPr>
-              <w:t>Main deliverable — 528 rows × 70 columns</w:t>
+              <w:t>Main deliverable — 528 rows × 72 columns</w:t>
             </w:r>
           </w:p>
         </w:tc>

</xml_diff>